<commit_message>
Extend Lau summary: Mirror AI-coaching project with sensitivity flag; game-feedback section pending content
Mirror described as planned/undelivered with explicit member-check clearance requirement; convergence with the coaching layer and self-engagement mechanism recorded; section 3.8 frames his game feedback awaiting date, build and substance.

Co-Authored-By: Claude Fable 5 <noreply@anthropic.com>
Claude-Session: https://claude.ai/code/session_01KoT3i8geZspYBMMKVYJUTG
</commit_message>
<xml_diff>
--- a/docs/thesis/expert_panel/Expert_Interview_Summary_GaryLau_DRAFT.docx
+++ b/docs/thesis/expert_panel/Expert_Interview_Summary_GaryLau_DRAFT.docx
@@ -129,6 +129,16 @@
       </w:r>
     </w:p>
     <w:p>
+      <w:r>
+        <w:t>3.7 The Mirror project — AI coaching in practice (author's account, 11 Aug 2026; SENSITIVITY FLAG below). AI coaching is not hypothetical in Dr Lau's programme: it is what his project with the researcher is building. The planned product is a home-installed Mirror in which an AI Avatar coach is displayed alongside the user's own reflection, guiding them through their exercise practice. In this design, gamification is the CONTENT layer, while the key mechanism is the user's SELF-AWARENESS and SELF-ENGAGEMENT — the avatar-in-the-mirror places the user's own body and progress at the centre of the interaction. The product is planned and not yet delivered; no efficacy claims are made or implied. SENSITIVITY FLAG: as an undelivered product concept, this description must be explicitly cleared by Dr Lau at member-checking before it appears in the thesis or any publication; if he prefers, it will be generalised to 'a planned avatar-guided AI-coaching interface for home exercise practice' or removed.</w:t>
+      </w:r>
+    </w:p>
+    <w:p>
+      <w:r>
+        <w:t>3.8 Reaction to the actual game [CONTENT TO BE SUPPLIED BY AUTHOR]. Dr Lau has played the study's game build. To be recorded here before this summary is finalised: (i) the date he played; (ii) which build (v2.3 touch / v3.0 Stage 3B); (iii) his feedback in substance, as close to his words as the author's notes allow; (iv) how it reached him and how he replied (for the transmittal record, as with Expert P's validation play).</w:t>
+      </w:r>
+    </w:p>
+    <w:p>
       <w:pPr>
         <w:pStyle w:val="Heading1"/>
       </w:pPr>
@@ -142,6 +152,9 @@
           <w:i w:val="0"/>
         </w:rPr>
         <w:t>(a) The coaching argument (§7.5, L6): Dr Lau independently identifies coaching as the most effective intervention AND establishes why human coaching cannot scale (family cost; therapist scarcity). This is the strongest practice-based justification in the panel record for the framework's coaching layer — and for AI's enabling role as the only affordable way to give every patient a coach. (b) Trajectory visibility (§7.5): his diagnosis that current technology lacks 'progressive, positive signs' across a boring, lonely journey maps directly onto the framework's visible-trajectory element, and connects to the loneliness findings of the PRISM literature already cited (§8.6B). (c) Sustained engagement as the scarce resource (§5.5, §8.5): his patience account converges with the programme's retention findings from a clinical population. (d) TIMING NUANCE, recorded honestly: in stroke rehabilitation he sees few first-attempt dropouts — abandonment comes later in the journey — whereas the FRA pattern showed early adverse-first-experience effects. The populations differ (clinically supervised rehabilitation under medical necessity vs voluntary preventive assessment), and the thesis must present his account as an adjacent-population perspective, not direct corroboration of FIDS timing. (e) People-centred technology: his embrace-but-do-not-over-rely position independently states the thesis's V32 boundary — AI as enabling tool, the human mechanism central. CAUTION: as with Expert P, Dr Lau was not asked the verdict-vs-game-failure attribution question; attribution corroboration rests on Dr Choy alone. Dr Lau's honest uncertainty (3.5, 3.6) is reported as such — his contribution is interpretation and clinical contextualisation, never a substitute for evidence.</w:t>
+      </w:r>
+      <w:r>
+        <w:t xml:space="preserve"> (f) The Mirror project as convergent design: the panel's clinician-developer is independently implementing the framework's coaching layer — an AI avatar absorbing the coaching function that section 3.6 argues humans cannot scale — and his design philosophy (gamification as content; self-awareness and self-engagement as the key mechanism) states, in a developer's vocabulary, the same self-concept-centred account the thesis reaches behaviourally: the user's relationship with their own performance, not the game, is where engagement is won or lost. Subject to the 3.7 sensitivity clearance, this is the panel's strongest convergence with the adaptive-learning framework. (g) His played-the-game feedback (3.8, pending) will stand beside Expert P's as the second artifact-level validation.</w:t>
       </w:r>
     </w:p>
     <w:p>
@@ -158,6 +171,9 @@
           <w:i w:val="0"/>
         </w:rPr>
         <w:t>Archived: signed + countersigned consent form (10-11 Aug 2026); written attribution election (WhatsApp screenshot — to be re-sent as a file); this summary drafted from the author's account of 11 Aug 2026. RECOMMENDED: send this summary to Dr Lau for member-checking, as done with Expert P ("Perfect") — his WhatsApp thread is active. To confirm: whether any audio was recorded (statement 6 permits it; researcher's notes presumed primary).</w:t>
+      </w:r>
+      <w:r>
+        <w:t xml:space="preserve"> ADDED 11 Aug 2026: Mirror-project account recorded with sensitivity flag; game-feedback section opened pending the author's supply of date/build/content.</w:t>
       </w:r>
     </w:p>
     <w:sectPr>

</xml_diff>